<commit_message>
Rework Word export: real cover page/footers, native TOC, table styling, fixed corruption bug
Adds scripts/inject_cover_page.py to splice the actual corporate cover page and
footer version/date into the pandoc-generated .docx (pandoc's --reference-doc only
carries styles, not body content), fixing a "content unreadable" repair prompt caused
by an empty verified-health-links entry and by leftover w:dataBinding pointing at a
customXml part that doesn't exist in the generated package. Also: native Word TOC via
pandoc --toc instead of a manual bullet list, bold/banded table style, category icons
removed, Verifizierte-Gesundheitsinformation split by audience, github-actions[bot]
filtered out of Bearbeitungshistorie, and the shown date pinned to the released
commit instead of build time.

Co-Authored-By: Claude Sonnet 5 <noreply@anthropic.com>
</commit_message>
<xml_diff>
--- a/render/templates/PräNUDGE Berichtsvorlage.docx
+++ b/render/templates/PräNUDGE Berichtsvorlage.docx
@@ -175,7 +175,7 @@
                                         <w:sz w:val="24"/>
                                         <w:szCs w:val="24"/>
                                       </w:rPr>
-                                      <w:t xml:space="preserve">[Vor- und Nachname </w:t>
+                                      <w:t xml:space="preserve">[Version: </w:t>
                                     </w:r>
                                     <w:r>
                                       <w:rPr>
@@ -185,7 +185,7 @@
                                         <w:sz w:val="24"/>
                                         <w:szCs w:val="24"/>
                                       </w:rPr>
-                                      <w:t>AUTor/IN</w:t>
+                                      <w:t>X</w:t>
                                     </w:r>
                                     <w:r>
                                       <w:rPr>
@@ -195,7 +195,97 @@
                                         <w:sz w:val="24"/>
                                         <w:szCs w:val="24"/>
                                       </w:rPr>
-                                      <w:t>]</w:t>
+                                      <w:t>.</w:t>
+                                    </w:r>
+                                    <w:r>
+                                      <w:rPr>
+                                        <w:b/>
+                                        <w:caps/>
+                                        <w:color w:val="00A256"/>
+                                        <w:sz w:val="24"/>
+                                        <w:szCs w:val="24"/>
+                                      </w:rPr>
+                                      <w:t>Y</w:t>
+                                    </w:r>
+                                    <w:r>
+                                      <w:rPr>
+                                        <w:b/>
+                                        <w:caps/>
+                                        <w:color w:val="00A256"/>
+                                        <w:sz w:val="24"/>
+                                        <w:szCs w:val="24"/>
+                                      </w:rPr>
+                                      <w:t>.</w:t>
+                                    </w:r>
+                                    <w:r>
+                                      <w:rPr>
+                                        <w:b/>
+                                        <w:caps/>
+                                        <w:color w:val="00A256"/>
+                                        <w:sz w:val="24"/>
+                                        <w:szCs w:val="24"/>
+                                      </w:rPr>
+                                      <w:t>Z</w:t>
+                                    </w:r>
+                                    <w:r>
+                                      <w:rPr>
+                                        <w:b/>
+                                        <w:caps/>
+                                        <w:color w:val="00A256"/>
+                                        <w:sz w:val="24"/>
+                                        <w:szCs w:val="24"/>
+                                      </w:rPr>
+                                      <w:t xml:space="preserve"> | Generiert: </w:t>
+                                    </w:r>
+                                    <w:r>
+                                      <w:rPr>
+                                        <w:b/>
+                                        <w:caps/>
+                                        <w:color w:val="00A256"/>
+                                        <w:sz w:val="24"/>
+                                        <w:szCs w:val="24"/>
+                                      </w:rPr>
+                                      <w:t>YYYY</w:t>
+                                    </w:r>
+                                    <w:r>
+                                      <w:rPr>
+                                        <w:b/>
+                                        <w:caps/>
+                                        <w:color w:val="00A256"/>
+                                        <w:sz w:val="24"/>
+                                        <w:szCs w:val="24"/>
+                                      </w:rPr>
+                                      <w:t>-</w:t>
+                                    </w:r>
+                                    <w:r>
+                                      <w:rPr>
+                                        <w:b/>
+                                        <w:caps/>
+                                        <w:color w:val="00A256"/>
+                                        <w:sz w:val="24"/>
+                                        <w:szCs w:val="24"/>
+                                      </w:rPr>
+                                      <w:t>MM</w:t>
+                                    </w:r>
+                                    <w:r>
+                                      <w:rPr>
+                                        <w:b/>
+                                        <w:caps/>
+                                        <w:color w:val="00A256"/>
+                                        <w:sz w:val="24"/>
+                                        <w:szCs w:val="24"/>
+                                      </w:rPr>
+                                      <w:t>-</w:t>
+                                    </w:r>
+                                    <w:r>
+                                      <w:rPr>
+                                        <w:b/>
+                                        <w:caps/>
+                                        <w:color w:val="00A256"/>
+                                        <w:sz w:val="24"/>
+                                        <w:szCs w:val="24"/>
+                                      </w:rPr>
+                                      <w:t>DD</w:t>
                                     </w:r>
                                   </w:p>
                                 </w:sdtContent>
@@ -278,7 +368,7 @@
                                   <w:sz w:val="24"/>
                                   <w:szCs w:val="24"/>
                                 </w:rPr>
-                                <w:t xml:space="preserve">[Vor- und Nachname </w:t>
+                                <w:t xml:space="preserve">[Version: </w:t>
                               </w:r>
                               <w:r>
                                 <w:rPr>
@@ -288,7 +378,7 @@
                                   <w:sz w:val="24"/>
                                   <w:szCs w:val="24"/>
                                 </w:rPr>
-                                <w:t>AUTor/IN</w:t>
+                                <w:t>X</w:t>
                               </w:r>
                               <w:r>
                                 <w:rPr>
@@ -298,7 +388,97 @@
                                   <w:sz w:val="24"/>
                                   <w:szCs w:val="24"/>
                                 </w:rPr>
-                                <w:t>]</w:t>
+                                <w:t>.</w:t>
+                              </w:r>
+                              <w:r>
+                                <w:rPr>
+                                  <w:b/>
+                                  <w:caps/>
+                                  <w:color w:val="00A256"/>
+                                  <w:sz w:val="24"/>
+                                  <w:szCs w:val="24"/>
+                                </w:rPr>
+                                <w:t>Y</w:t>
+                              </w:r>
+                              <w:r>
+                                <w:rPr>
+                                  <w:b/>
+                                  <w:caps/>
+                                  <w:color w:val="00A256"/>
+                                  <w:sz w:val="24"/>
+                                  <w:szCs w:val="24"/>
+                                </w:rPr>
+                                <w:t>.</w:t>
+                              </w:r>
+                              <w:r>
+                                <w:rPr>
+                                  <w:b/>
+                                  <w:caps/>
+                                  <w:color w:val="00A256"/>
+                                  <w:sz w:val="24"/>
+                                  <w:szCs w:val="24"/>
+                                </w:rPr>
+                                <w:t>Z</w:t>
+                              </w:r>
+                              <w:r>
+                                <w:rPr>
+                                  <w:b/>
+                                  <w:caps/>
+                                  <w:color w:val="00A256"/>
+                                  <w:sz w:val="24"/>
+                                  <w:szCs w:val="24"/>
+                                </w:rPr>
+                                <w:t xml:space="preserve"> | Generiert: </w:t>
+                              </w:r>
+                              <w:r>
+                                <w:rPr>
+                                  <w:b/>
+                                  <w:caps/>
+                                  <w:color w:val="00A256"/>
+                                  <w:sz w:val="24"/>
+                                  <w:szCs w:val="24"/>
+                                </w:rPr>
+                                <w:t>YYYY</w:t>
+                              </w:r>
+                              <w:r>
+                                <w:rPr>
+                                  <w:b/>
+                                  <w:caps/>
+                                  <w:color w:val="00A256"/>
+                                  <w:sz w:val="24"/>
+                                  <w:szCs w:val="24"/>
+                                </w:rPr>
+                                <w:t>-</w:t>
+                              </w:r>
+                              <w:r>
+                                <w:rPr>
+                                  <w:b/>
+                                  <w:caps/>
+                                  <w:color w:val="00A256"/>
+                                  <w:sz w:val="24"/>
+                                  <w:szCs w:val="24"/>
+                                </w:rPr>
+                                <w:t>MM</w:t>
+                              </w:r>
+                              <w:r>
+                                <w:rPr>
+                                  <w:b/>
+                                  <w:caps/>
+                                  <w:color w:val="00A256"/>
+                                  <w:sz w:val="24"/>
+                                  <w:szCs w:val="24"/>
+                                </w:rPr>
+                                <w:t>-</w:t>
+                              </w:r>
+                              <w:r>
+                                <w:rPr>
+                                  <w:b/>
+                                  <w:caps/>
+                                  <w:color w:val="00A256"/>
+                                  <w:sz w:val="24"/>
+                                  <w:szCs w:val="24"/>
+                                </w:rPr>
+                                <w:t>DD</w:t>
                               </w:r>
                             </w:p>
                           </w:sdtContent>
@@ -2688,11 +2868,19 @@
           <w:lang w:val="de-DE"/>
         </w:rPr>
       </w:pPr>
-      <w:r>
-        <w:rPr>
-          <w:lang w:val="de-DE"/>
-        </w:rPr>
-        <w:t xml:space="preserve">Lorem </w:t>
+      <w:proofErr w:type="spellStart"/>
+      <w:r>
+        <w:rPr>
+          <w:lang w:val="de-DE"/>
+        </w:rPr>
+        <w:t>Lorem</w:t>
+      </w:r>
+      <w:proofErr w:type="spellEnd"/>
+      <w:r>
+        <w:rPr>
+          <w:lang w:val="de-DE"/>
+        </w:rPr>
+        <w:t xml:space="preserve"> </w:t>
       </w:r>
       <w:proofErr w:type="spellStart"/>
       <w:r>
@@ -3412,11 +3600,19 @@
           <w:lang w:val="de-DE"/>
         </w:rPr>
       </w:pPr>
-      <w:r>
-        <w:rPr>
-          <w:lang w:val="de-DE"/>
-        </w:rPr>
-        <w:t xml:space="preserve">Lorem </w:t>
+      <w:proofErr w:type="spellStart"/>
+      <w:r>
+        <w:rPr>
+          <w:lang w:val="de-DE"/>
+        </w:rPr>
+        <w:t>Lorem</w:t>
+      </w:r>
+      <w:proofErr w:type="spellEnd"/>
+      <w:r>
+        <w:rPr>
+          <w:lang w:val="de-DE"/>
+        </w:rPr>
+        <w:t xml:space="preserve"> </w:t>
       </w:r>
       <w:proofErr w:type="spellStart"/>
       <w:r>
@@ -3649,6 +3845,239 @@
     </w:p>
     <w:p>
       <w:pPr>
+        <w:pStyle w:val="berschrift3"/>
+        <w:rPr>
+          <w:lang w:val="de-DE"/>
+        </w:rPr>
+      </w:pPr>
+      <w:r>
+        <w:rPr>
+          <w:lang w:val="de-DE"/>
+        </w:rPr>
+        <w:t>[</w:t>
+      </w:r>
+      <w:proofErr w:type="spellStart"/>
+      <w:r>
+        <w:rPr>
+          <w:lang w:val="de-DE"/>
+        </w:rPr>
+        <w:t>Sub</w:t>
+      </w:r>
+      <w:r>
+        <w:rPr>
+          <w:lang w:val="de-DE"/>
+        </w:rPr>
+        <w:t>Sub</w:t>
+      </w:r>
+      <w:r>
+        <w:rPr>
+          <w:lang w:val="de-DE"/>
+        </w:rPr>
+        <w:t>inhalt</w:t>
+      </w:r>
+      <w:proofErr w:type="spellEnd"/>
+      <w:r>
+        <w:rPr>
+          <w:lang w:val="de-DE"/>
+        </w:rPr>
+        <w:t xml:space="preserve"> </w:t>
+      </w:r>
+      <w:r>
+        <w:rPr>
+          <w:lang w:val="de-DE"/>
+        </w:rPr>
+        <w:t>1</w:t>
+      </w:r>
+      <w:r>
+        <w:rPr>
+          <w:lang w:val="de-DE"/>
+        </w:rPr>
+        <w:t>]</w:t>
+      </w:r>
+    </w:p>
+    <w:p>
+      <w:pPr>
+        <w:rPr>
+          <w:lang w:val="de-DE"/>
+        </w:rPr>
+      </w:pPr>
+    </w:p>
+    <w:p>
+      <w:pPr>
+        <w:pStyle w:val="berschrift4"/>
+        <w:rPr>
+          <w:lang w:val="de-DE"/>
+        </w:rPr>
+      </w:pPr>
+      <w:r>
+        <w:rPr>
+          <w:lang w:val="de-DE"/>
+        </w:rPr>
+        <w:t>[</w:t>
+      </w:r>
+      <w:proofErr w:type="spellStart"/>
+      <w:r>
+        <w:rPr>
+          <w:lang w:val="de-DE"/>
+        </w:rPr>
+        <w:t>SubSub</w:t>
+      </w:r>
+      <w:r>
+        <w:rPr>
+          <w:lang w:val="de-DE"/>
+        </w:rPr>
+        <w:t>Sub</w:t>
+      </w:r>
+      <w:r>
+        <w:rPr>
+          <w:lang w:val="de-DE"/>
+        </w:rPr>
+        <w:t>inhalt</w:t>
+      </w:r>
+      <w:proofErr w:type="spellEnd"/>
+      <w:r>
+        <w:rPr>
+          <w:lang w:val="de-DE"/>
+        </w:rPr>
+        <w:t xml:space="preserve"> </w:t>
+      </w:r>
+      <w:r>
+        <w:rPr>
+          <w:lang w:val="de-DE"/>
+        </w:rPr>
+        <w:t>1</w:t>
+      </w:r>
+      <w:r>
+        <w:rPr>
+          <w:lang w:val="de-DE"/>
+        </w:rPr>
+        <w:t>]</w:t>
+      </w:r>
+    </w:p>
+    <w:p>
+      <w:pPr>
+        <w:pStyle w:val="berschrift5"/>
+        <w:rPr>
+          <w:lang w:val="de-DE"/>
+        </w:rPr>
+      </w:pPr>
+      <w:r>
+        <w:rPr>
+          <w:lang w:val="de-DE"/>
+        </w:rPr>
+        <w:t>[</w:t>
+      </w:r>
+      <w:proofErr w:type="spellStart"/>
+      <w:r>
+        <w:rPr>
+          <w:lang w:val="de-DE"/>
+        </w:rPr>
+        <w:t>SubSubSub</w:t>
+      </w:r>
+      <w:r>
+        <w:rPr>
+          <w:lang w:val="de-DE"/>
+        </w:rPr>
+        <w:t>Sub</w:t>
+      </w:r>
+      <w:r>
+        <w:rPr>
+          <w:lang w:val="de-DE"/>
+        </w:rPr>
+        <w:t>inhalt</w:t>
+      </w:r>
+      <w:proofErr w:type="spellEnd"/>
+      <w:r>
+        <w:rPr>
+          <w:lang w:val="de-DE"/>
+        </w:rPr>
+        <w:t xml:space="preserve"> 1]</w:t>
+      </w:r>
+    </w:p>
+    <w:p>
+      <w:pPr>
+        <w:rPr>
+          <w:lang w:val="de-DE"/>
+        </w:rPr>
+      </w:pPr>
+    </w:p>
+    <w:p>
+      <w:pPr>
+        <w:pStyle w:val="berschrift4"/>
+        <w:rPr>
+          <w:lang w:val="de-DE"/>
+        </w:rPr>
+      </w:pPr>
+      <w:r>
+        <w:rPr>
+          <w:lang w:val="de-DE"/>
+        </w:rPr>
+        <w:t>[</w:t>
+      </w:r>
+      <w:proofErr w:type="spellStart"/>
+      <w:r>
+        <w:rPr>
+          <w:lang w:val="de-DE"/>
+        </w:rPr>
+        <w:t>SubSubSubinhalt</w:t>
+      </w:r>
+      <w:proofErr w:type="spellEnd"/>
+      <w:r>
+        <w:rPr>
+          <w:lang w:val="de-DE"/>
+        </w:rPr>
+        <w:t xml:space="preserve"> 2]</w:t>
+      </w:r>
+    </w:p>
+    <w:p>
+      <w:pPr>
+        <w:rPr>
+          <w:lang w:val="de-DE"/>
+        </w:rPr>
+      </w:pPr>
+    </w:p>
+    <w:p>
+      <w:pPr>
+        <w:pStyle w:val="berschrift3"/>
+        <w:rPr>
+          <w:lang w:val="de-DE"/>
+        </w:rPr>
+      </w:pPr>
+      <w:r>
+        <w:rPr>
+          <w:lang w:val="de-DE"/>
+        </w:rPr>
+        <w:t>[</w:t>
+      </w:r>
+      <w:proofErr w:type="spellStart"/>
+      <w:r>
+        <w:rPr>
+          <w:lang w:val="de-DE"/>
+        </w:rPr>
+        <w:t>SubSubinhalt</w:t>
+      </w:r>
+      <w:proofErr w:type="spellEnd"/>
+      <w:r>
+        <w:rPr>
+          <w:lang w:val="de-DE"/>
+        </w:rPr>
+        <w:t xml:space="preserve"> </w:t>
+      </w:r>
+      <w:r>
+        <w:rPr>
+          <w:lang w:val="de-DE"/>
+        </w:rPr>
+        <w:t>2</w:t>
+      </w:r>
+      <w:r>
+        <w:rPr>
+          <w:lang w:val="de-DE"/>
+        </w:rPr>
+        <w:t>]</w:t>
+      </w:r>
+    </w:p>
+    <w:p>
+      <w:pPr>
         <w:pStyle w:val="berschrift2"/>
         <w:rPr>
           <w:lang w:val="de-DE"/>
@@ -3698,7 +4127,7 @@
     </w:p>
     <w:tbl>
       <w:tblPr>
-        <w:tblStyle w:val="Tabellenraster"/>
+        <w:tblStyle w:val="Gitternetztabelle6farbigAkzent3"/>
         <w:tblW w:w="0" w:type="auto"/>
         <w:tblLook w:val="04A0" w:firstRow="1" w:lastRow="0" w:firstColumn="1" w:lastColumn="0" w:noHBand="0" w:noVBand="1"/>
       </w:tblPr>
@@ -3707,14 +4136,83 @@
         <w:gridCol w:w="4531"/>
       </w:tblGrid>
       <w:tr>
+        <w:trPr>
+          <w:cnfStyle w:val="100000000000" w:firstRow="1" w:lastRow="0" w:firstColumn="0" w:lastColumn="0" w:oddVBand="0" w:evenVBand="0" w:oddHBand="0" w:evenHBand="0" w:firstRowFirstColumn="0" w:firstRowLastColumn="0" w:lastRowFirstColumn="0" w:lastRowLastColumn="0"/>
+        </w:trPr>
+        <w:tc>
+          <w:tcPr>
+            <w:cnfStyle w:val="001000000000" w:firstRow="0" w:lastRow="0" w:firstColumn="1" w:lastColumn="0" w:oddVBand="0" w:evenVBand="0" w:oddHBand="0" w:evenHBand="0" w:firstRowFirstColumn="0" w:firstRowLastColumn="0" w:lastRowFirstColumn="0" w:lastRowLastColumn="0"/>
+            <w:tcW w:w="4531" w:type="dxa"/>
+          </w:tcPr>
+          <w:p>
+            <w:pPr>
+              <w:rPr>
+                <w:rFonts w:eastAsia="Times New Roman" w:cstheme="minorHAnsi"/>
+                <w:color w:val="000000"/>
+                <w:sz w:val="24"/>
+                <w:szCs w:val="24"/>
+                <w:lang w:eastAsia="de-AT"/>
+              </w:rPr>
+            </w:pPr>
+            <w:r>
+              <w:rPr>
+                <w:rFonts w:eastAsia="Times New Roman" w:cstheme="minorHAnsi"/>
+                <w:color w:val="000000"/>
+                <w:sz w:val="24"/>
+                <w:szCs w:val="24"/>
+                <w:lang w:eastAsia="de-AT"/>
+              </w:rPr>
+              <w:t>Metadatenfeld</w:t>
+            </w:r>
+          </w:p>
+        </w:tc>
         <w:tc>
           <w:tcPr>
             <w:tcW w:w="4531" w:type="dxa"/>
           </w:tcPr>
           <w:p>
             <w:pPr>
-              <w:rPr>
-                <w:lang w:val="en-US"/>
+              <w:cnfStyle w:val="100000000000" w:firstRow="1" w:lastRow="0" w:firstColumn="0" w:lastColumn="0" w:oddVBand="0" w:evenVBand="0" w:oddHBand="0" w:evenHBand="0" w:firstRowFirstColumn="0" w:firstRowLastColumn="0" w:lastRowFirstColumn="0" w:lastRowLastColumn="0"/>
+              <w:rPr>
+                <w:rFonts w:eastAsia="Times New Roman" w:cstheme="minorHAnsi"/>
+                <w:color w:val="000000"/>
+                <w:sz w:val="24"/>
+                <w:szCs w:val="24"/>
+                <w:lang w:eastAsia="de-AT"/>
+              </w:rPr>
+            </w:pPr>
+            <w:r>
+              <w:rPr>
+                <w:rFonts w:eastAsia="Times New Roman" w:cstheme="minorHAnsi"/>
+                <w:color w:val="000000"/>
+                <w:sz w:val="24"/>
+                <w:szCs w:val="24"/>
+                <w:lang w:eastAsia="de-AT"/>
+              </w:rPr>
+              <w:t>Wert</w:t>
+            </w:r>
+          </w:p>
+        </w:tc>
+      </w:tr>
+      <w:tr>
+        <w:trPr>
+          <w:cnfStyle w:val="000000100000" w:firstRow="0" w:lastRow="0" w:firstColumn="0" w:lastColumn="0" w:oddVBand="0" w:evenVBand="0" w:oddHBand="1" w:evenHBand="0" w:firstRowFirstColumn="0" w:firstRowLastColumn="0" w:lastRowFirstColumn="0" w:lastRowLastColumn="0"/>
+        </w:trPr>
+        <w:tc>
+          <w:tcPr>
+            <w:cnfStyle w:val="001000000000" w:firstRow="0" w:lastRow="0" w:firstColumn="1" w:lastColumn="0" w:oddVBand="0" w:evenVBand="0" w:oddHBand="0" w:evenHBand="0" w:firstRowFirstColumn="0" w:firstRowLastColumn="0" w:lastRowFirstColumn="0" w:lastRowLastColumn="0"/>
+            <w:tcW w:w="4531" w:type="dxa"/>
+          </w:tcPr>
+          <w:p>
+            <w:pPr>
+              <w:rPr>
+                <w:rFonts w:ascii="Calibri" w:eastAsia="Times New Roman" w:hAnsi="Calibri" w:cs="Calibri"/>
+                <w:b w:val="0"/>
+                <w:bCs w:val="0"/>
+                <w:color w:val="000000"/>
+                <w:sz w:val="24"/>
+                <w:szCs w:val="24"/>
+                <w:lang w:eastAsia="de-AT"/>
               </w:rPr>
             </w:pPr>
           </w:p>
@@ -3725,8 +4223,15 @@
           </w:tcPr>
           <w:p>
             <w:pPr>
-              <w:rPr>
-                <w:lang w:val="en-US"/>
+              <w:cnfStyle w:val="000000100000" w:firstRow="0" w:lastRow="0" w:firstColumn="0" w:lastColumn="0" w:oddVBand="0" w:evenVBand="0" w:oddHBand="1" w:evenHBand="0" w:firstRowFirstColumn="0" w:firstRowLastColumn="0" w:lastRowFirstColumn="0" w:lastRowLastColumn="0"/>
+              <w:rPr>
+                <w:rFonts w:ascii="Calibri" w:eastAsia="Times New Roman" w:hAnsi="Calibri" w:cs="Calibri"/>
+                <w:b/>
+                <w:bCs/>
+                <w:color w:val="000000"/>
+                <w:sz w:val="24"/>
+                <w:szCs w:val="24"/>
+                <w:lang w:eastAsia="de-AT"/>
               </w:rPr>
             </w:pPr>
           </w:p>
@@ -3735,12 +4240,19 @@
       <w:tr>
         <w:tc>
           <w:tcPr>
+            <w:cnfStyle w:val="001000000000" w:firstRow="0" w:lastRow="0" w:firstColumn="1" w:lastColumn="0" w:oddVBand="0" w:evenVBand="0" w:oddHBand="0" w:evenHBand="0" w:firstRowFirstColumn="0" w:firstRowLastColumn="0" w:lastRowFirstColumn="0" w:lastRowLastColumn="0"/>
             <w:tcW w:w="4531" w:type="dxa"/>
           </w:tcPr>
           <w:p>
             <w:pPr>
               <w:rPr>
-                <w:lang w:val="en-US"/>
+                <w:rFonts w:ascii="Calibri" w:eastAsia="Times New Roman" w:hAnsi="Calibri" w:cs="Calibri"/>
+                <w:b w:val="0"/>
+                <w:bCs w:val="0"/>
+                <w:color w:val="000000"/>
+                <w:sz w:val="24"/>
+                <w:szCs w:val="24"/>
+                <w:lang w:eastAsia="de-AT"/>
               </w:rPr>
             </w:pPr>
           </w:p>
@@ -3751,31 +4263,24 @@
           </w:tcPr>
           <w:p>
             <w:pPr>
-              <w:rPr>
-                <w:lang w:val="en-US"/>
+              <w:cnfStyle w:val="000000000000" w:firstRow="0" w:lastRow="0" w:firstColumn="0" w:lastColumn="0" w:oddVBand="0" w:evenVBand="0" w:oddHBand="0" w:evenHBand="0" w:firstRowFirstColumn="0" w:firstRowLastColumn="0" w:lastRowFirstColumn="0" w:lastRowLastColumn="0"/>
+              <w:rPr>
+                <w:rFonts w:ascii="Calibri" w:eastAsia="Times New Roman" w:hAnsi="Calibri" w:cs="Calibri"/>
+                <w:b/>
+                <w:bCs/>
+                <w:color w:val="000000"/>
+                <w:sz w:val="24"/>
+                <w:szCs w:val="24"/>
+                <w:lang w:eastAsia="de-AT"/>
               </w:rPr>
             </w:pPr>
           </w:p>
         </w:tc>
       </w:tr>
     </w:tbl>
+    <w:p/>
     <w:p>
-      <w:pPr>
-        <w:rPr>
-          <w:lang w:val="en-US"/>
-        </w:rPr>
-      </w:pPr>
-    </w:p>
-    <w:p>
-      <w:pPr>
-        <w:rPr>
-          <w:lang w:val="en-US"/>
-        </w:rPr>
-      </w:pPr>
-      <w:r>
-        <w:rPr>
-          <w:lang w:val="en-US"/>
-        </w:rPr>
+      <w:r>
         <w:br w:type="page"/>
       </w:r>
     </w:p>
@@ -4267,11 +4772,19 @@
           <w:lang w:val="de-DE"/>
         </w:rPr>
       </w:pPr>
-      <w:r>
-        <w:rPr>
-          <w:lang w:val="de-DE"/>
-        </w:rPr>
-        <w:t xml:space="preserve">Lorem </w:t>
+      <w:proofErr w:type="spellStart"/>
+      <w:r>
+        <w:rPr>
+          <w:lang w:val="de-DE"/>
+        </w:rPr>
+        <w:t>Lorem</w:t>
+      </w:r>
+      <w:proofErr w:type="spellEnd"/>
+      <w:r>
+        <w:rPr>
+          <w:lang w:val="de-DE"/>
+        </w:rPr>
+        <w:t xml:space="preserve"> </w:t>
       </w:r>
       <w:proofErr w:type="spellStart"/>
       <w:r>
@@ -4991,11 +5504,19 @@
           <w:lang w:val="de-DE"/>
         </w:rPr>
       </w:pPr>
-      <w:r>
-        <w:rPr>
-          <w:lang w:val="de-DE"/>
-        </w:rPr>
-        <w:t xml:space="preserve">Lorem </w:t>
+      <w:proofErr w:type="spellStart"/>
+      <w:r>
+        <w:rPr>
+          <w:lang w:val="de-DE"/>
+        </w:rPr>
+        <w:t>Lorem</w:t>
+      </w:r>
+      <w:proofErr w:type="spellEnd"/>
+      <w:r>
+        <w:rPr>
+          <w:lang w:val="de-DE"/>
+        </w:rPr>
+        <w:t xml:space="preserve"> </w:t>
       </w:r>
       <w:proofErr w:type="spellStart"/>
       <w:r>
@@ -5991,7 +6512,7 @@
         <w:noProof/>
         <w:lang w:val="en-GB"/>
       </w:rPr>
-      <w:t>27-Jul-2026</w:t>
+      <w:t>26-Aug-2026</w:t>
     </w:r>
     <w:r>
       <w:rPr>
@@ -6309,6 +6830,119 @@
     </w:lvl>
   </w:abstractNum>
   <w:abstractNum w:abstractNumId="2" w15:restartNumberingAfterBreak="0">
+    <w:nsid w:val="228829E2"/>
+    <w:multiLevelType w:val="multilevel"/>
+    <w:tmpl w:val="BE149762"/>
+    <w:lvl w:ilvl="0">
+      <w:start w:val="1"/>
+      <w:numFmt w:val="bullet"/>
+      <w:lvlText w:val="·"/>
+      <w:lvlJc w:val="left"/>
+      <w:pPr>
+        <w:ind w:left="709" w:hanging="360"/>
+      </w:pPr>
+      <w:rPr>
+        <w:rFonts w:ascii="Symbol" w:eastAsia="Symbol" w:hAnsi="Symbol" w:cs="Symbol" w:hint="default"/>
+      </w:rPr>
+    </w:lvl>
+    <w:lvl w:ilvl="1">
+      <w:start w:val="1"/>
+      <w:numFmt w:val="bullet"/>
+      <w:lvlText w:val="o"/>
+      <w:lvlJc w:val="left"/>
+      <w:pPr>
+        <w:ind w:left="1429" w:hanging="360"/>
+      </w:pPr>
+      <w:rPr>
+        <w:rFonts w:ascii="Courier New" w:eastAsia="Courier New" w:hAnsi="Courier New" w:cs="Courier New" w:hint="default"/>
+      </w:rPr>
+    </w:lvl>
+    <w:lvl w:ilvl="2">
+      <w:start w:val="1"/>
+      <w:numFmt w:val="bullet"/>
+      <w:lvlText w:val="§"/>
+      <w:lvlJc w:val="left"/>
+      <w:pPr>
+        <w:ind w:left="2149" w:hanging="360"/>
+      </w:pPr>
+      <w:rPr>
+        <w:rFonts w:ascii="Wingdings" w:eastAsia="Wingdings" w:hAnsi="Wingdings" w:cs="Wingdings" w:hint="default"/>
+      </w:rPr>
+    </w:lvl>
+    <w:lvl w:ilvl="3">
+      <w:start w:val="1"/>
+      <w:numFmt w:val="bullet"/>
+      <w:lvlText w:val="·"/>
+      <w:lvlJc w:val="left"/>
+      <w:pPr>
+        <w:ind w:left="2869" w:hanging="360"/>
+      </w:pPr>
+      <w:rPr>
+        <w:rFonts w:ascii="Symbol" w:eastAsia="Symbol" w:hAnsi="Symbol" w:cs="Symbol" w:hint="default"/>
+      </w:rPr>
+    </w:lvl>
+    <w:lvl w:ilvl="4">
+      <w:start w:val="1"/>
+      <w:numFmt w:val="bullet"/>
+      <w:lvlText w:val="o"/>
+      <w:lvlJc w:val="left"/>
+      <w:pPr>
+        <w:ind w:left="3589" w:hanging="360"/>
+      </w:pPr>
+      <w:rPr>
+        <w:rFonts w:ascii="Courier New" w:eastAsia="Courier New" w:hAnsi="Courier New" w:cs="Courier New" w:hint="default"/>
+      </w:rPr>
+    </w:lvl>
+    <w:lvl w:ilvl="5">
+      <w:start w:val="1"/>
+      <w:numFmt w:val="bullet"/>
+      <w:lvlText w:val="§"/>
+      <w:lvlJc w:val="left"/>
+      <w:pPr>
+        <w:ind w:left="4309" w:hanging="360"/>
+      </w:pPr>
+      <w:rPr>
+        <w:rFonts w:ascii="Wingdings" w:eastAsia="Wingdings" w:hAnsi="Wingdings" w:cs="Wingdings" w:hint="default"/>
+      </w:rPr>
+    </w:lvl>
+    <w:lvl w:ilvl="6">
+      <w:start w:val="1"/>
+      <w:numFmt w:val="bullet"/>
+      <w:lvlText w:val="·"/>
+      <w:lvlJc w:val="left"/>
+      <w:pPr>
+        <w:ind w:left="5029" w:hanging="360"/>
+      </w:pPr>
+      <w:rPr>
+        <w:rFonts w:ascii="Symbol" w:eastAsia="Symbol" w:hAnsi="Symbol" w:cs="Symbol" w:hint="default"/>
+      </w:rPr>
+    </w:lvl>
+    <w:lvl w:ilvl="7">
+      <w:start w:val="1"/>
+      <w:numFmt w:val="bullet"/>
+      <w:lvlText w:val="o"/>
+      <w:lvlJc w:val="left"/>
+      <w:pPr>
+        <w:ind w:left="5749" w:hanging="360"/>
+      </w:pPr>
+      <w:rPr>
+        <w:rFonts w:ascii="Courier New" w:eastAsia="Courier New" w:hAnsi="Courier New" w:cs="Courier New" w:hint="default"/>
+      </w:rPr>
+    </w:lvl>
+    <w:lvl w:ilvl="8">
+      <w:start w:val="1"/>
+      <w:numFmt w:val="bullet"/>
+      <w:lvlText w:val="§"/>
+      <w:lvlJc w:val="left"/>
+      <w:pPr>
+        <w:ind w:left="6469" w:hanging="360"/>
+      </w:pPr>
+      <w:rPr>
+        <w:rFonts w:ascii="Wingdings" w:eastAsia="Wingdings" w:hAnsi="Wingdings" w:cs="Wingdings" w:hint="default"/>
+      </w:rPr>
+    </w:lvl>
+  </w:abstractNum>
+  <w:abstractNum w:abstractNumId="3" w15:restartNumberingAfterBreak="0">
     <w:nsid w:val="27BB6D55"/>
     <w:multiLevelType w:val="hybridMultilevel"/>
     <w:tmpl w:val="6A107C08"/>
@@ -6394,7 +7028,7 @@
       </w:pPr>
     </w:lvl>
   </w:abstractNum>
-  <w:abstractNum w:abstractNumId="3" w15:restartNumberingAfterBreak="0">
+  <w:abstractNum w:abstractNumId="4" w15:restartNumberingAfterBreak="0">
     <w:nsid w:val="2E361A85"/>
     <w:multiLevelType w:val="multilevel"/>
     <w:tmpl w:val="9646A4B6"/>
@@ -6507,7 +7141,7 @@
       </w:rPr>
     </w:lvl>
   </w:abstractNum>
-  <w:abstractNum w:abstractNumId="4" w15:restartNumberingAfterBreak="0">
+  <w:abstractNum w:abstractNumId="5" w15:restartNumberingAfterBreak="0">
     <w:nsid w:val="33521E81"/>
     <w:multiLevelType w:val="multilevel"/>
     <w:tmpl w:val="0C07001F"/>
@@ -6596,7 +7230,7 @@
       </w:pPr>
     </w:lvl>
   </w:abstractNum>
-  <w:abstractNum w:abstractNumId="5" w15:restartNumberingAfterBreak="0">
+  <w:abstractNum w:abstractNumId="6" w15:restartNumberingAfterBreak="0">
     <w:nsid w:val="3E143B9F"/>
     <w:multiLevelType w:val="hybridMultilevel"/>
     <w:tmpl w:val="FFBA51FE"/>
@@ -6682,7 +7316,7 @@
       </w:pPr>
     </w:lvl>
   </w:abstractNum>
-  <w:abstractNum w:abstractNumId="6" w15:restartNumberingAfterBreak="0">
+  <w:abstractNum w:abstractNumId="7" w15:restartNumberingAfterBreak="0">
     <w:nsid w:val="3F031F82"/>
     <w:multiLevelType w:val="hybridMultilevel"/>
     <w:tmpl w:val="F61638A4"/>
@@ -6795,7 +7429,7 @@
       </w:rPr>
     </w:lvl>
   </w:abstractNum>
-  <w:abstractNum w:abstractNumId="7" w15:restartNumberingAfterBreak="0">
+  <w:abstractNum w:abstractNumId="8" w15:restartNumberingAfterBreak="0">
     <w:nsid w:val="52554A3E"/>
     <w:multiLevelType w:val="multilevel"/>
     <w:tmpl w:val="0C07001F"/>
@@ -6884,7 +7518,7 @@
       </w:pPr>
     </w:lvl>
   </w:abstractNum>
-  <w:abstractNum w:abstractNumId="8" w15:restartNumberingAfterBreak="0">
+  <w:abstractNum w:abstractNumId="9" w15:restartNumberingAfterBreak="0">
     <w:nsid w:val="54D65F52"/>
     <w:multiLevelType w:val="multilevel"/>
     <w:tmpl w:val="0C07001F"/>
@@ -6971,31 +7605,34 @@
     </w:lvl>
   </w:abstractNum>
   <w:num w:numId="1" w16cid:durableId="788858391">
-    <w:abstractNumId w:val="6"/>
+    <w:abstractNumId w:val="7"/>
   </w:num>
   <w:num w:numId="2" w16cid:durableId="938106242">
-    <w:abstractNumId w:val="2"/>
+    <w:abstractNumId w:val="3"/>
   </w:num>
   <w:num w:numId="3" w16cid:durableId="1639645765">
-    <w:abstractNumId w:val="7"/>
+    <w:abstractNumId w:val="8"/>
   </w:num>
   <w:num w:numId="4" w16cid:durableId="1556355972">
     <w:abstractNumId w:val="1"/>
   </w:num>
   <w:num w:numId="5" w16cid:durableId="770782668">
-    <w:abstractNumId w:val="3"/>
+    <w:abstractNumId w:val="4"/>
   </w:num>
   <w:num w:numId="6" w16cid:durableId="385682593">
-    <w:abstractNumId w:val="8"/>
+    <w:abstractNumId w:val="9"/>
   </w:num>
   <w:num w:numId="7" w16cid:durableId="2085756634">
-    <w:abstractNumId w:val="4"/>
+    <w:abstractNumId w:val="5"/>
   </w:num>
   <w:num w:numId="8" w16cid:durableId="1118985266">
-    <w:abstractNumId w:val="5"/>
+    <w:abstractNumId w:val="6"/>
   </w:num>
   <w:num w:numId="9" w16cid:durableId="210653356">
     <w:abstractNumId w:val="0"/>
+  </w:num>
+  <w:num w:numId="10" w16cid:durableId="983199442">
+    <w:abstractNumId w:val="2"/>
   </w:num>
 </w:numbering>
 </file>
@@ -7512,7 +8149,6 @@
     <w:next w:val="Standard"/>
     <w:link w:val="berschrift5Zchn"/>
     <w:uiPriority w:val="9"/>
-    <w:semiHidden/>
     <w:unhideWhenUsed/>
     <w:qFormat/>
     <w:rsid w:val="005B36A8"/>
@@ -7857,7 +8493,7 @@
       </w:tblBorders>
     </w:tblPr>
   </w:style>
-  <w:style w:type="table" w:styleId="Table">
+  <w:style w:type="table" w:customStyle="1" w:styleId="Table">
     <w:name w:val="Table"/>
     <w:basedOn w:val="NormaleTabelle"/>
     <w:uiPriority w:val="39"/>
@@ -7865,15 +8501,35 @@
       <w:spacing w:after="0" w:line="240" w:lineRule="auto"/>
     </w:pPr>
     <w:tblPr>
+      <w:tblStyleRowBandSize w:val="1"/>
       <w:tblBorders>
-        <w:top w:val="single" w:sz="4" w:space="0" w:color="auto"/>
-        <w:left w:val="single" w:sz="4" w:space="0" w:color="auto"/>
-        <w:bottom w:val="single" w:sz="4" w:space="0" w:color="auto"/>
-        <w:right w:val="single" w:sz="4" w:space="0" w:color="auto"/>
-        <w:insideH w:val="single" w:sz="4" w:space="0" w:color="auto"/>
-        <w:insideV w:val="single" w:sz="4" w:space="0" w:color="auto"/>
+        <w:top w:val="single" w:sz="4" w:space="0" w:color="D9D9D9"/>
+        <w:left w:val="single" w:sz="4" w:space="0" w:color="D9D9D9"/>
+        <w:bottom w:val="single" w:sz="4" w:space="0" w:color="D9D9D9"/>
+        <w:right w:val="single" w:sz="4" w:space="0" w:color="D9D9D9"/>
+        <w:insideH w:val="single" w:sz="4" w:space="0" w:color="D9D9D9"/>
+        <w:insideV w:val="single" w:sz="4" w:space="0" w:color="D9D9D9"/>
       </w:tblBorders>
+      <w:tblCellMar>
+        <w:top w:w="60" w:type="dxa"/>
+        <w:bottom w:w="60" w:type="dxa"/>
+      </w:tblCellMar>
     </w:tblPr>
+    <w:tblStylePr w:type="firstRow">
+      <w:rPr>
+        <w:b/>
+      </w:rPr>
+    </w:tblStylePr>
+    <w:tblStylePr w:type="band1Horz">
+      <w:tcPr>
+        <w:shd w:val="clear" w:color="auto" w:fill="F2F2F2"/>
+      </w:tcPr>
+    </w:tblStylePr>
+    <w:tblStylePr w:type="band2Horz">
+      <w:tcPr>
+        <w:shd w:val="clear" w:color="auto" w:fill="FFFFFF"/>
+      </w:tcPr>
+    </w:tblStylePr>
   </w:style>
   <w:style w:type="paragraph" w:customStyle="1" w:styleId="Zeitpunktmessung">
     <w:name w:val="Zeitpunktmessung"/>
@@ -7972,6 +8628,22 @@
       <w:ind w:left="220"/>
     </w:pPr>
   </w:style>
+  <w:style w:type="paragraph" w:styleId="Verzeichnis3">
+    <w:name w:val="toc 3"/>
+    <w:basedOn w:val="Standard"/>
+    <w:next w:val="Standard"/>
+    <w:autoRedefine/>
+    <w:uiPriority w:val="39"/>
+    <w:unhideWhenUsed/>
+    <w:rsid w:val="00C81E6A"/>
+    <w:pPr>
+      <w:tabs>
+        <w:tab w:val="right" w:leader="dot" w:pos="9062"/>
+      </w:tabs>
+      <w:spacing w:after="100"/>
+      <w:ind w:left="440"/>
+    </w:pPr>
+  </w:style>
   <w:style w:type="character" w:styleId="Hyperlink">
     <w:name w:val="Hyperlink"/>
     <w:basedOn w:val="Absatz-Standardschriftart"/>
@@ -8001,7 +8673,6 @@
     <w:basedOn w:val="Absatz-Standardschriftart"/>
     <w:link w:val="berschrift5"/>
     <w:uiPriority w:val="9"/>
-    <w:semiHidden/>
     <w:rsid w:val="005B36A8"/>
     <w:rPr>
       <w:rFonts w:asciiTheme="majorHAnsi" w:eastAsiaTheme="majorEastAsia" w:hAnsiTheme="majorHAnsi" w:cstheme="majorBidi"/>
@@ -8112,6 +8783,501 @@
           <w:insideV w:val="nil"/>
         </w:tcBorders>
         <w:shd w:val="clear" w:color="auto" w:fill="FFFFFF" w:themeFill="background1"/>
+      </w:tcPr>
+    </w:tblStylePr>
+    <w:tblStylePr w:type="firstCol">
+      <w:rPr>
+        <w:b/>
+        <w:bCs/>
+      </w:rPr>
+    </w:tblStylePr>
+    <w:tblStylePr w:type="lastCol">
+      <w:rPr>
+        <w:b/>
+        <w:bCs/>
+      </w:rPr>
+    </w:tblStylePr>
+    <w:tblStylePr w:type="band1Vert">
+      <w:tblPr/>
+      <w:tcPr>
+        <w:shd w:val="clear" w:color="auto" w:fill="EDEDED" w:themeFill="accent3" w:themeFillTint="33"/>
+      </w:tcPr>
+    </w:tblStylePr>
+    <w:tblStylePr w:type="band1Horz">
+      <w:tblPr/>
+      <w:tcPr>
+        <w:shd w:val="clear" w:color="auto" w:fill="EDEDED" w:themeFill="accent3" w:themeFillTint="33"/>
+      </w:tcPr>
+    </w:tblStylePr>
+  </w:style>
+  <w:style w:type="table" w:styleId="Gitternetztabelle2">
+    <w:name w:val="Grid Table 2"/>
+    <w:basedOn w:val="NormaleTabelle"/>
+    <w:uiPriority w:val="47"/>
+    <w:rsid w:val="00712BAB"/>
+    <w:pPr>
+      <w:spacing w:after="0" w:line="240" w:lineRule="auto"/>
+    </w:pPr>
+    <w:tblPr>
+      <w:tblStyleRowBandSize w:val="1"/>
+      <w:tblStyleColBandSize w:val="1"/>
+      <w:tblBorders>
+        <w:top w:val="single" w:sz="2" w:space="0" w:color="666666" w:themeColor="text1" w:themeTint="99"/>
+        <w:bottom w:val="single" w:sz="2" w:space="0" w:color="666666" w:themeColor="text1" w:themeTint="99"/>
+        <w:insideH w:val="single" w:sz="2" w:space="0" w:color="666666" w:themeColor="text1" w:themeTint="99"/>
+        <w:insideV w:val="single" w:sz="2" w:space="0" w:color="666666" w:themeColor="text1" w:themeTint="99"/>
+      </w:tblBorders>
+    </w:tblPr>
+    <w:tblStylePr w:type="firstRow">
+      <w:rPr>
+        <w:b/>
+        <w:bCs/>
+      </w:rPr>
+      <w:tblPr/>
+      <w:tcPr>
+        <w:tcBorders>
+          <w:top w:val="nil"/>
+          <w:bottom w:val="single" w:sz="12" w:space="0" w:color="666666" w:themeColor="text1" w:themeTint="99"/>
+          <w:insideH w:val="nil"/>
+          <w:insideV w:val="nil"/>
+        </w:tcBorders>
+        <w:shd w:val="clear" w:color="auto" w:fill="FFFFFF" w:themeFill="background1"/>
+      </w:tcPr>
+    </w:tblStylePr>
+    <w:tblStylePr w:type="lastRow">
+      <w:rPr>
+        <w:b/>
+        <w:bCs/>
+      </w:rPr>
+      <w:tblPr/>
+      <w:tcPr>
+        <w:tcBorders>
+          <w:top w:val="double" w:sz="2" w:space="0" w:color="666666" w:themeColor="text1" w:themeTint="99"/>
+          <w:bottom w:val="nil"/>
+          <w:insideH w:val="nil"/>
+          <w:insideV w:val="nil"/>
+        </w:tcBorders>
+        <w:shd w:val="clear" w:color="auto" w:fill="FFFFFF" w:themeFill="background1"/>
+      </w:tcPr>
+    </w:tblStylePr>
+    <w:tblStylePr w:type="firstCol">
+      <w:rPr>
+        <w:b/>
+        <w:bCs/>
+      </w:rPr>
+    </w:tblStylePr>
+    <w:tblStylePr w:type="lastCol">
+      <w:rPr>
+        <w:b/>
+        <w:bCs/>
+      </w:rPr>
+    </w:tblStylePr>
+    <w:tblStylePr w:type="band1Vert">
+      <w:tblPr/>
+      <w:tcPr>
+        <w:shd w:val="clear" w:color="auto" w:fill="CCCCCC" w:themeFill="text1" w:themeFillTint="33"/>
+      </w:tcPr>
+    </w:tblStylePr>
+    <w:tblStylePr w:type="band1Horz">
+      <w:tblPr/>
+      <w:tcPr>
+        <w:shd w:val="clear" w:color="auto" w:fill="CCCCCC" w:themeFill="text1" w:themeFillTint="33"/>
+      </w:tcPr>
+    </w:tblStylePr>
+  </w:style>
+  <w:style w:type="table" w:styleId="Gitternetztabelle6farbig">
+    <w:name w:val="Grid Table 6 Colorful"/>
+    <w:basedOn w:val="NormaleTabelle"/>
+    <w:uiPriority w:val="51"/>
+    <w:rsid w:val="008045A1"/>
+    <w:pPr>
+      <w:spacing w:after="0" w:line="240" w:lineRule="auto"/>
+    </w:pPr>
+    <w:rPr>
+      <w:color w:val="000000" w:themeColor="text1"/>
+    </w:rPr>
+    <w:tblPr>
+      <w:tblStyleRowBandSize w:val="1"/>
+      <w:tblStyleColBandSize w:val="1"/>
+      <w:tblBorders>
+        <w:top w:val="single" w:sz="4" w:space="0" w:color="666666" w:themeColor="text1" w:themeTint="99"/>
+        <w:left w:val="single" w:sz="4" w:space="0" w:color="666666" w:themeColor="text1" w:themeTint="99"/>
+        <w:bottom w:val="single" w:sz="4" w:space="0" w:color="666666" w:themeColor="text1" w:themeTint="99"/>
+        <w:right w:val="single" w:sz="4" w:space="0" w:color="666666" w:themeColor="text1" w:themeTint="99"/>
+        <w:insideH w:val="single" w:sz="4" w:space="0" w:color="666666" w:themeColor="text1" w:themeTint="99"/>
+        <w:insideV w:val="single" w:sz="4" w:space="0" w:color="666666" w:themeColor="text1" w:themeTint="99"/>
+      </w:tblBorders>
+    </w:tblPr>
+    <w:tblStylePr w:type="firstRow">
+      <w:rPr>
+        <w:b/>
+        <w:bCs/>
+      </w:rPr>
+      <w:tblPr/>
+      <w:tcPr>
+        <w:tcBorders>
+          <w:bottom w:val="single" w:sz="12" w:space="0" w:color="666666" w:themeColor="text1" w:themeTint="99"/>
+        </w:tcBorders>
+      </w:tcPr>
+    </w:tblStylePr>
+    <w:tblStylePr w:type="lastRow">
+      <w:rPr>
+        <w:b/>
+        <w:bCs/>
+      </w:rPr>
+      <w:tblPr/>
+      <w:tcPr>
+        <w:tcBorders>
+          <w:top w:val="double" w:sz="4" w:space="0" w:color="666666" w:themeColor="text1" w:themeTint="99"/>
+        </w:tcBorders>
+      </w:tcPr>
+    </w:tblStylePr>
+    <w:tblStylePr w:type="firstCol">
+      <w:rPr>
+        <w:b/>
+        <w:bCs/>
+      </w:rPr>
+    </w:tblStylePr>
+    <w:tblStylePr w:type="lastCol">
+      <w:rPr>
+        <w:b/>
+        <w:bCs/>
+      </w:rPr>
+    </w:tblStylePr>
+    <w:tblStylePr w:type="band1Vert">
+      <w:tblPr/>
+      <w:tcPr>
+        <w:shd w:val="clear" w:color="auto" w:fill="CCCCCC" w:themeFill="text1" w:themeFillTint="33"/>
+      </w:tcPr>
+    </w:tblStylePr>
+    <w:tblStylePr w:type="band1Horz">
+      <w:tblPr/>
+      <w:tcPr>
+        <w:shd w:val="clear" w:color="auto" w:fill="CCCCCC" w:themeFill="text1" w:themeFillTint="33"/>
+      </w:tcPr>
+    </w:tblStylePr>
+  </w:style>
+  <w:style w:type="table" w:styleId="Listentabelle6farbig">
+    <w:name w:val="List Table 6 Colorful"/>
+    <w:basedOn w:val="NormaleTabelle"/>
+    <w:uiPriority w:val="51"/>
+    <w:rsid w:val="008045A1"/>
+    <w:pPr>
+      <w:spacing w:after="0" w:line="240" w:lineRule="auto"/>
+    </w:pPr>
+    <w:rPr>
+      <w:color w:val="000000" w:themeColor="text1"/>
+    </w:rPr>
+    <w:tblPr>
+      <w:tblStyleRowBandSize w:val="1"/>
+      <w:tblStyleColBandSize w:val="1"/>
+      <w:tblBorders>
+        <w:top w:val="single" w:sz="4" w:space="0" w:color="000000" w:themeColor="text1"/>
+        <w:bottom w:val="single" w:sz="4" w:space="0" w:color="000000" w:themeColor="text1"/>
+      </w:tblBorders>
+    </w:tblPr>
+    <w:tblStylePr w:type="firstRow">
+      <w:rPr>
+        <w:b/>
+        <w:bCs/>
+      </w:rPr>
+      <w:tblPr/>
+      <w:tcPr>
+        <w:tcBorders>
+          <w:bottom w:val="single" w:sz="4" w:space="0" w:color="000000" w:themeColor="text1"/>
+        </w:tcBorders>
+      </w:tcPr>
+    </w:tblStylePr>
+    <w:tblStylePr w:type="lastRow">
+      <w:rPr>
+        <w:b/>
+        <w:bCs/>
+      </w:rPr>
+      <w:tblPr/>
+      <w:tcPr>
+        <w:tcBorders>
+          <w:top w:val="double" w:sz="4" w:space="0" w:color="000000" w:themeColor="text1"/>
+        </w:tcBorders>
+      </w:tcPr>
+    </w:tblStylePr>
+    <w:tblStylePr w:type="firstCol">
+      <w:rPr>
+        <w:b/>
+        <w:bCs/>
+      </w:rPr>
+    </w:tblStylePr>
+    <w:tblStylePr w:type="lastCol">
+      <w:rPr>
+        <w:b/>
+        <w:bCs/>
+      </w:rPr>
+    </w:tblStylePr>
+    <w:tblStylePr w:type="band1Vert">
+      <w:tblPr/>
+      <w:tcPr>
+        <w:shd w:val="clear" w:color="auto" w:fill="CCCCCC" w:themeFill="text1" w:themeFillTint="33"/>
+      </w:tcPr>
+    </w:tblStylePr>
+    <w:tblStylePr w:type="band1Horz">
+      <w:tblPr/>
+      <w:tcPr>
+        <w:shd w:val="clear" w:color="auto" w:fill="CCCCCC" w:themeFill="text1" w:themeFillTint="33"/>
+      </w:tcPr>
+    </w:tblStylePr>
+  </w:style>
+  <w:style w:type="table" w:styleId="EinfacheTabelle1">
+    <w:name w:val="Plain Table 1"/>
+    <w:basedOn w:val="NormaleTabelle"/>
+    <w:uiPriority w:val="41"/>
+    <w:rsid w:val="008045A1"/>
+    <w:pPr>
+      <w:spacing w:after="0" w:line="240" w:lineRule="auto"/>
+    </w:pPr>
+    <w:tblPr>
+      <w:tblStyleRowBandSize w:val="1"/>
+      <w:tblStyleColBandSize w:val="1"/>
+      <w:tblBorders>
+        <w:top w:val="single" w:sz="4" w:space="0" w:color="BFBFBF" w:themeColor="background1" w:themeShade="BF"/>
+        <w:left w:val="single" w:sz="4" w:space="0" w:color="BFBFBF" w:themeColor="background1" w:themeShade="BF"/>
+        <w:bottom w:val="single" w:sz="4" w:space="0" w:color="BFBFBF" w:themeColor="background1" w:themeShade="BF"/>
+        <w:right w:val="single" w:sz="4" w:space="0" w:color="BFBFBF" w:themeColor="background1" w:themeShade="BF"/>
+        <w:insideH w:val="single" w:sz="4" w:space="0" w:color="BFBFBF" w:themeColor="background1" w:themeShade="BF"/>
+        <w:insideV w:val="single" w:sz="4" w:space="0" w:color="BFBFBF" w:themeColor="background1" w:themeShade="BF"/>
+      </w:tblBorders>
+    </w:tblPr>
+    <w:tblStylePr w:type="firstRow">
+      <w:rPr>
+        <w:b/>
+        <w:bCs/>
+      </w:rPr>
+    </w:tblStylePr>
+    <w:tblStylePr w:type="lastRow">
+      <w:rPr>
+        <w:b/>
+        <w:bCs/>
+      </w:rPr>
+      <w:tblPr/>
+      <w:tcPr>
+        <w:tcBorders>
+          <w:top w:val="double" w:sz="4" w:space="0" w:color="BFBFBF" w:themeColor="background1" w:themeShade="BF"/>
+        </w:tcBorders>
+      </w:tcPr>
+    </w:tblStylePr>
+    <w:tblStylePr w:type="firstCol">
+      <w:rPr>
+        <w:b/>
+        <w:bCs/>
+      </w:rPr>
+    </w:tblStylePr>
+    <w:tblStylePr w:type="lastCol">
+      <w:rPr>
+        <w:b/>
+        <w:bCs/>
+      </w:rPr>
+    </w:tblStylePr>
+    <w:tblStylePr w:type="band1Vert">
+      <w:tblPr/>
+      <w:tcPr>
+        <w:shd w:val="clear" w:color="auto" w:fill="F2F2F2" w:themeFill="background1" w:themeFillShade="F2"/>
+      </w:tcPr>
+    </w:tblStylePr>
+    <w:tblStylePr w:type="band1Horz">
+      <w:tblPr/>
+      <w:tcPr>
+        <w:shd w:val="clear" w:color="auto" w:fill="F2F2F2" w:themeFill="background1" w:themeFillShade="F2"/>
+      </w:tcPr>
+    </w:tblStylePr>
+  </w:style>
+  <w:style w:type="table" w:styleId="Gitternetztabelle1hellAkzent3">
+    <w:name w:val="Grid Table 1 Light Accent 3"/>
+    <w:basedOn w:val="NormaleTabelle"/>
+    <w:uiPriority w:val="46"/>
+    <w:rsid w:val="008045A1"/>
+    <w:pPr>
+      <w:spacing w:after="0" w:line="240" w:lineRule="auto"/>
+    </w:pPr>
+    <w:tblPr>
+      <w:tblStyleRowBandSize w:val="1"/>
+      <w:tblStyleColBandSize w:val="1"/>
+      <w:tblBorders>
+        <w:top w:val="single" w:sz="4" w:space="0" w:color="DBDBDB" w:themeColor="accent3" w:themeTint="66"/>
+        <w:left w:val="single" w:sz="4" w:space="0" w:color="DBDBDB" w:themeColor="accent3" w:themeTint="66"/>
+        <w:bottom w:val="single" w:sz="4" w:space="0" w:color="DBDBDB" w:themeColor="accent3" w:themeTint="66"/>
+        <w:right w:val="single" w:sz="4" w:space="0" w:color="DBDBDB" w:themeColor="accent3" w:themeTint="66"/>
+        <w:insideH w:val="single" w:sz="4" w:space="0" w:color="DBDBDB" w:themeColor="accent3" w:themeTint="66"/>
+        <w:insideV w:val="single" w:sz="4" w:space="0" w:color="DBDBDB" w:themeColor="accent3" w:themeTint="66"/>
+      </w:tblBorders>
+    </w:tblPr>
+    <w:tblStylePr w:type="firstRow">
+      <w:rPr>
+        <w:b/>
+        <w:bCs/>
+      </w:rPr>
+      <w:tblPr/>
+      <w:tcPr>
+        <w:tcBorders>
+          <w:bottom w:val="single" w:sz="12" w:space="0" w:color="C9C9C9" w:themeColor="accent3" w:themeTint="99"/>
+        </w:tcBorders>
+      </w:tcPr>
+    </w:tblStylePr>
+    <w:tblStylePr w:type="lastRow">
+      <w:rPr>
+        <w:b/>
+        <w:bCs/>
+      </w:rPr>
+      <w:tblPr/>
+      <w:tcPr>
+        <w:tcBorders>
+          <w:top w:val="double" w:sz="2" w:space="0" w:color="C9C9C9" w:themeColor="accent3" w:themeTint="99"/>
+        </w:tcBorders>
+      </w:tcPr>
+    </w:tblStylePr>
+    <w:tblStylePr w:type="firstCol">
+      <w:rPr>
+        <w:b/>
+        <w:bCs/>
+      </w:rPr>
+    </w:tblStylePr>
+    <w:tblStylePr w:type="lastCol">
+      <w:rPr>
+        <w:b/>
+        <w:bCs/>
+      </w:rPr>
+    </w:tblStylePr>
+  </w:style>
+  <w:style w:type="table" w:styleId="Gitternetztabelle4Akzent3">
+    <w:name w:val="Grid Table 4 Accent 3"/>
+    <w:basedOn w:val="NormaleTabelle"/>
+    <w:uiPriority w:val="49"/>
+    <w:rsid w:val="008045A1"/>
+    <w:pPr>
+      <w:spacing w:after="0" w:line="240" w:lineRule="auto"/>
+    </w:pPr>
+    <w:tblPr>
+      <w:tblStyleRowBandSize w:val="1"/>
+      <w:tblStyleColBandSize w:val="1"/>
+      <w:tblBorders>
+        <w:top w:val="single" w:sz="4" w:space="0" w:color="C9C9C9" w:themeColor="accent3" w:themeTint="99"/>
+        <w:left w:val="single" w:sz="4" w:space="0" w:color="C9C9C9" w:themeColor="accent3" w:themeTint="99"/>
+        <w:bottom w:val="single" w:sz="4" w:space="0" w:color="C9C9C9" w:themeColor="accent3" w:themeTint="99"/>
+        <w:right w:val="single" w:sz="4" w:space="0" w:color="C9C9C9" w:themeColor="accent3" w:themeTint="99"/>
+        <w:insideH w:val="single" w:sz="4" w:space="0" w:color="C9C9C9" w:themeColor="accent3" w:themeTint="99"/>
+        <w:insideV w:val="single" w:sz="4" w:space="0" w:color="C9C9C9" w:themeColor="accent3" w:themeTint="99"/>
+      </w:tblBorders>
+    </w:tblPr>
+    <w:tblStylePr w:type="firstRow">
+      <w:rPr>
+        <w:b/>
+        <w:bCs/>
+        <w:color w:val="FFFFFF" w:themeColor="background1"/>
+      </w:rPr>
+      <w:tblPr/>
+      <w:tcPr>
+        <w:tcBorders>
+          <w:top w:val="single" w:sz="4" w:space="0" w:color="A5A5A5" w:themeColor="accent3"/>
+          <w:left w:val="single" w:sz="4" w:space="0" w:color="A5A5A5" w:themeColor="accent3"/>
+          <w:bottom w:val="single" w:sz="4" w:space="0" w:color="A5A5A5" w:themeColor="accent3"/>
+          <w:right w:val="single" w:sz="4" w:space="0" w:color="A5A5A5" w:themeColor="accent3"/>
+          <w:insideH w:val="nil"/>
+          <w:insideV w:val="nil"/>
+        </w:tcBorders>
+        <w:shd w:val="clear" w:color="auto" w:fill="A5A5A5" w:themeFill="accent3"/>
+      </w:tcPr>
+    </w:tblStylePr>
+    <w:tblStylePr w:type="lastRow">
+      <w:rPr>
+        <w:b/>
+        <w:bCs/>
+      </w:rPr>
+      <w:tblPr/>
+      <w:tcPr>
+        <w:tcBorders>
+          <w:top w:val="double" w:sz="4" w:space="0" w:color="A5A5A5" w:themeColor="accent3"/>
+        </w:tcBorders>
+      </w:tcPr>
+    </w:tblStylePr>
+    <w:tblStylePr w:type="firstCol">
+      <w:rPr>
+        <w:b/>
+        <w:bCs/>
+      </w:rPr>
+    </w:tblStylePr>
+    <w:tblStylePr w:type="lastCol">
+      <w:rPr>
+        <w:b/>
+        <w:bCs/>
+      </w:rPr>
+    </w:tblStylePr>
+    <w:tblStylePr w:type="band1Vert">
+      <w:tblPr/>
+      <w:tcPr>
+        <w:shd w:val="clear" w:color="auto" w:fill="EDEDED" w:themeFill="accent3" w:themeFillTint="33"/>
+      </w:tcPr>
+    </w:tblStylePr>
+    <w:tblStylePr w:type="band1Horz">
+      <w:tblPr/>
+      <w:tcPr>
+        <w:shd w:val="clear" w:color="auto" w:fill="EDEDED" w:themeFill="accent3" w:themeFillTint="33"/>
+      </w:tcPr>
+    </w:tblStylePr>
+  </w:style>
+  <w:style w:type="character" w:styleId="Kommentarzeichen">
+    <w:name w:val="annotation reference"/>
+    <w:basedOn w:val="Absatz-Standardschriftart"/>
+    <w:uiPriority w:val="99"/>
+    <w:semiHidden/>
+    <w:unhideWhenUsed/>
+    <w:rsid w:val="008045A1"/>
+    <w:rPr>
+      <w:sz w:val="16"/>
+      <w:szCs w:val="16"/>
+    </w:rPr>
+  </w:style>
+  <w:style w:type="table" w:styleId="Gitternetztabelle6farbigAkzent3">
+    <w:name w:val="Grid Table 6 Colorful Accent 3"/>
+    <w:basedOn w:val="NormaleTabelle"/>
+    <w:uiPriority w:val="51"/>
+    <w:rsid w:val="00B956AA"/>
+    <w:pPr>
+      <w:spacing w:after="0" w:line="240" w:lineRule="auto"/>
+    </w:pPr>
+    <w:rPr>
+      <w:color w:val="7B7B7B" w:themeColor="accent3" w:themeShade="BF"/>
+    </w:rPr>
+    <w:tblPr>
+      <w:tblStyleRowBandSize w:val="1"/>
+      <w:tblStyleColBandSize w:val="1"/>
+      <w:tblBorders>
+        <w:top w:val="single" w:sz="4" w:space="0" w:color="C9C9C9" w:themeColor="accent3" w:themeTint="99"/>
+        <w:left w:val="single" w:sz="4" w:space="0" w:color="C9C9C9" w:themeColor="accent3" w:themeTint="99"/>
+        <w:bottom w:val="single" w:sz="4" w:space="0" w:color="C9C9C9" w:themeColor="accent3" w:themeTint="99"/>
+        <w:right w:val="single" w:sz="4" w:space="0" w:color="C9C9C9" w:themeColor="accent3" w:themeTint="99"/>
+        <w:insideH w:val="single" w:sz="4" w:space="0" w:color="C9C9C9" w:themeColor="accent3" w:themeTint="99"/>
+        <w:insideV w:val="single" w:sz="4" w:space="0" w:color="C9C9C9" w:themeColor="accent3" w:themeTint="99"/>
+      </w:tblBorders>
+    </w:tblPr>
+    <w:tblStylePr w:type="firstRow">
+      <w:rPr>
+        <w:b/>
+        <w:bCs/>
+      </w:rPr>
+      <w:tblPr/>
+      <w:tcPr>
+        <w:tcBorders>
+          <w:bottom w:val="single" w:sz="12" w:space="0" w:color="C9C9C9" w:themeColor="accent3" w:themeTint="99"/>
+        </w:tcBorders>
+      </w:tcPr>
+    </w:tblStylePr>
+    <w:tblStylePr w:type="lastRow">
+      <w:rPr>
+        <w:b/>
+        <w:bCs/>
+      </w:rPr>
+      <w:tblPr/>
+      <w:tcPr>
+        <w:tcBorders>
+          <w:top w:val="double" w:sz="4" w:space="0" w:color="C9C9C9" w:themeColor="accent3" w:themeTint="99"/>
+        </w:tcBorders>
       </w:tcPr>
     </w:tblStylePr>
     <w:tblStylePr w:type="firstCol">

</xml_diff>